<commit_message>
Make tables for all lists in 3 parts
</commit_message>
<xml_diff>
--- a/MAPK8IP3 6s.docx
+++ b/MAPK8IP3 6s.docx
@@ -117,7 +117,7 @@
                 <w:sz w:val="20"/>
                 <w:b w:val="true"/>
               </w:rPr>
-              <w:t xml:space="preserve">Acetaminophen</w:t>
+              <w:t xml:space="preserve">Acetylcysteine</w:t>
             </w:r>
           </w:p>
         </w:tc>
@@ -142,7 +142,7 @@
                 <w:rFonts w:ascii="Calibri" w:hAnsi="Calibri"/>
                 <w:sz w:val="20"/>
               </w:rPr>
-              <w:t xml:space="preserve">analgesic</w:t>
+              <w:t xml:space="preserve">mucolytic</w:t>
             </w:r>
           </w:p>
         </w:tc>
@@ -167,7 +167,7 @@
                 <w:rFonts w:ascii="Calibri" w:hAnsi="Calibri"/>
                 <w:sz w:val="20"/>
               </w:rPr>
-              <w:t xml:space="preserve">Protein of interest (ARF6, DRD2, LRRK2, NTRK2, SPAG9) modulator</w:t>
+              <w:t xml:space="preserve">Anti-inflammatory</w:t>
             </w:r>
           </w:p>
         </w:tc>
@@ -198,55 +198,55 @@
                 <w:sz w:val="20"/>
                 <w:b w:val="true"/>
               </w:rPr>
-              <w:t xml:space="preserve">Acetylcysteine</w:t>
-            </w:r>
-          </w:p>
-        </w:tc>
-        <w:tc>
-          <w:tcPr>
-            <w:tcBorders>
-              <w:top w:val="single" w:space="0" w:color="D3D3D3"/>
-              <w:bottom w:val="single" w:space="0" w:color="D3D3D3"/>
-              <w:start w:val="single" w:space="0" w:color="D3D3D3"/>
-              <w:end w:val="single" w:space="0" w:color="D3D3D3"/>
-            </w:tcBorders>
-          </w:tcPr>
-          <w:p>
-            <w:pPr>
-              <w:spacing w:before="0" w:after="60"/>
-              <w:keepNext/>
-              <w:jc w:val="center"/>
-            </w:pPr>
-            <w:r>
-              <w:rPr>
-                <w:rFonts w:ascii="Calibri" w:hAnsi="Calibri"/>
-                <w:sz w:val="20"/>
-              </w:rPr>
-              <w:t xml:space="preserve">mucolytic</w:t>
-            </w:r>
-          </w:p>
-        </w:tc>
-        <w:tc>
-          <w:tcPr>
-            <w:tcBorders>
-              <w:top w:val="single" w:space="0" w:color="D3D3D3"/>
-              <w:bottom w:val="single" w:space="0" w:color="D3D3D3"/>
-              <w:start w:val="single" w:space="0" w:color="D3D3D3"/>
-              <w:end w:val="single" w:space="0" w:color="D3D3D3"/>
-            </w:tcBorders>
-          </w:tcPr>
-          <w:p>
-            <w:pPr>
-              <w:spacing w:before="0" w:after="60"/>
-              <w:keepNext/>
-              <w:jc w:val="center"/>
-            </w:pPr>
-            <w:r>
-              <w:rPr>
-                <w:rFonts w:ascii="Calibri" w:hAnsi="Calibri"/>
-                <w:sz w:val="20"/>
-              </w:rPr>
-              <w:t xml:space="preserve">Anti-inflammatory</w:t>
+              <w:t xml:space="preserve">Amitriptyline</w:t>
+            </w:r>
+          </w:p>
+        </w:tc>
+        <w:tc>
+          <w:tcPr>
+            <w:tcBorders>
+              <w:top w:val="single" w:space="0" w:color="D3D3D3"/>
+              <w:bottom w:val="single" w:space="0" w:color="D3D3D3"/>
+              <w:start w:val="single" w:space="0" w:color="D3D3D3"/>
+              <w:end w:val="single" w:space="0" w:color="D3D3D3"/>
+            </w:tcBorders>
+          </w:tcPr>
+          <w:p>
+            <w:pPr>
+              <w:spacing w:before="0" w:after="60"/>
+              <w:keepNext/>
+              <w:jc w:val="center"/>
+            </w:pPr>
+            <w:r>
+              <w:rPr>
+                <w:rFonts w:ascii="Calibri" w:hAnsi="Calibri"/>
+                <w:sz w:val="20"/>
+              </w:rPr>
+              <w:t xml:space="preserve">antidepressant</w:t>
+            </w:r>
+          </w:p>
+        </w:tc>
+        <w:tc>
+          <w:tcPr>
+            <w:tcBorders>
+              <w:top w:val="single" w:space="0" w:color="D3D3D3"/>
+              <w:bottom w:val="single" w:space="0" w:color="D3D3D3"/>
+              <w:start w:val="single" w:space="0" w:color="D3D3D3"/>
+              <w:end w:val="single" w:space="0" w:color="D3D3D3"/>
+            </w:tcBorders>
+          </w:tcPr>
+          <w:p>
+            <w:pPr>
+              <w:spacing w:before="0" w:after="60"/>
+              <w:keepNext/>
+              <w:jc w:val="center"/>
+            </w:pPr>
+            <w:r>
+              <w:rPr>
+                <w:rFonts w:ascii="Calibri" w:hAnsi="Calibri"/>
+                <w:sz w:val="20"/>
+              </w:rPr>
+              <w:t xml:space="preserve">Increase neurotransmitter signaling, Protein of interest (NTRK2) modulator</w:t>
             </w:r>
           </w:p>
         </w:tc>
@@ -277,7 +277,7 @@
                 <w:sz w:val="20"/>
                 <w:b w:val="true"/>
               </w:rPr>
-              <w:t xml:space="preserve">Amitriptyline</w:t>
+              <w:t xml:space="preserve">Azelaic acid</w:t>
             </w:r>
           </w:p>
         </w:tc>
@@ -302,7 +302,7 @@
                 <w:rFonts w:ascii="Calibri" w:hAnsi="Calibri"/>
                 <w:sz w:val="20"/>
               </w:rPr>
-              <w:t xml:space="preserve">antidepressant</w:t>
+              <w:t xml:space="preserve">antimicrobial</w:t>
             </w:r>
           </w:p>
         </w:tc>
@@ -327,7 +327,7 @@
                 <w:rFonts w:ascii="Calibri" w:hAnsi="Calibri"/>
                 <w:sz w:val="20"/>
               </w:rPr>
-              <w:t xml:space="preserve">Increase neurotransmitter signaling, Protein of interest (NTRK2) modulator</w:t>
+              <w:t xml:space="preserve">Anti-inflammatory, Anti-microbial, Protein of interest (JNK, LRRK2) modulator</w:t>
             </w:r>
           </w:p>
         </w:tc>
@@ -358,55 +358,55 @@
                 <w:sz w:val="20"/>
                 <w:b w:val="true"/>
               </w:rPr>
-              <w:t xml:space="preserve">Azelaic acid</w:t>
-            </w:r>
-          </w:p>
-        </w:tc>
-        <w:tc>
-          <w:tcPr>
-            <w:tcBorders>
-              <w:top w:val="single" w:space="0" w:color="D3D3D3"/>
-              <w:bottom w:val="single" w:space="0" w:color="D3D3D3"/>
-              <w:start w:val="single" w:space="0" w:color="D3D3D3"/>
-              <w:end w:val="single" w:space="0" w:color="D3D3D3"/>
-            </w:tcBorders>
-          </w:tcPr>
-          <w:p>
-            <w:pPr>
-              <w:spacing w:before="0" w:after="60"/>
-              <w:keepNext/>
-              <w:jc w:val="center"/>
-            </w:pPr>
-            <w:r>
-              <w:rPr>
-                <w:rFonts w:ascii="Calibri" w:hAnsi="Calibri"/>
-                <w:sz w:val="20"/>
-              </w:rPr>
-              <w:t xml:space="preserve">antimicrobial</w:t>
-            </w:r>
-          </w:p>
-        </w:tc>
-        <w:tc>
-          <w:tcPr>
-            <w:tcBorders>
-              <w:top w:val="single" w:space="0" w:color="D3D3D3"/>
-              <w:bottom w:val="single" w:space="0" w:color="D3D3D3"/>
-              <w:start w:val="single" w:space="0" w:color="D3D3D3"/>
-              <w:end w:val="single" w:space="0" w:color="D3D3D3"/>
-            </w:tcBorders>
-          </w:tcPr>
-          <w:p>
-            <w:pPr>
-              <w:spacing w:before="0" w:after="60"/>
-              <w:keepNext/>
-              <w:jc w:val="center"/>
-            </w:pPr>
-            <w:r>
-              <w:rPr>
-                <w:rFonts w:ascii="Calibri" w:hAnsi="Calibri"/>
-                <w:sz w:val="20"/>
-              </w:rPr>
-              <w:t xml:space="preserve">Anti-inflammatory, Anti-microbial, Protein of interest (JNK, LRRK2) modulator</w:t>
+              <w:t xml:space="preserve">Betamethasone</w:t>
+            </w:r>
+          </w:p>
+        </w:tc>
+        <w:tc>
+          <w:tcPr>
+            <w:tcBorders>
+              <w:top w:val="single" w:space="0" w:color="D3D3D3"/>
+              <w:bottom w:val="single" w:space="0" w:color="D3D3D3"/>
+              <w:start w:val="single" w:space="0" w:color="D3D3D3"/>
+              <w:end w:val="single" w:space="0" w:color="D3D3D3"/>
+            </w:tcBorders>
+          </w:tcPr>
+          <w:p>
+            <w:pPr>
+              <w:spacing w:before="0" w:after="60"/>
+              <w:keepNext/>
+              <w:jc w:val="center"/>
+            </w:pPr>
+            <w:r>
+              <w:rPr>
+                <w:rFonts w:ascii="Calibri" w:hAnsi="Calibri"/>
+                <w:sz w:val="20"/>
+              </w:rPr>
+              <w:t xml:space="preserve">corticosteroid</w:t>
+            </w:r>
+          </w:p>
+        </w:tc>
+        <w:tc>
+          <w:tcPr>
+            <w:tcBorders>
+              <w:top w:val="single" w:space="0" w:color="D3D3D3"/>
+              <w:bottom w:val="single" w:space="0" w:color="D3D3D3"/>
+              <w:start w:val="single" w:space="0" w:color="D3D3D3"/>
+              <w:end w:val="single" w:space="0" w:color="D3D3D3"/>
+            </w:tcBorders>
+          </w:tcPr>
+          <w:p>
+            <w:pPr>
+              <w:spacing w:before="0" w:after="60"/>
+              <w:keepNext/>
+              <w:jc w:val="center"/>
+            </w:pPr>
+            <w:r>
+              <w:rPr>
+                <w:rFonts w:ascii="Calibri" w:hAnsi="Calibri"/>
+                <w:sz w:val="20"/>
+              </w:rPr>
+              <w:t xml:space="preserve">Anti-inflammatory, Protein of interest (ARF6, CDK5) modulator, Symptomatic relief (ataxia)</w:t>
             </w:r>
           </w:p>
         </w:tc>
@@ -437,7 +437,7 @@
                 <w:sz w:val="20"/>
                 <w:b w:val="true"/>
               </w:rPr>
-              <w:t xml:space="preserve">Betamethasone</w:t>
+              <w:t xml:space="preserve">Biotin</w:t>
             </w:r>
           </w:p>
         </w:tc>
@@ -462,7 +462,7 @@
                 <w:rFonts w:ascii="Calibri" w:hAnsi="Calibri"/>
                 <w:sz w:val="20"/>
               </w:rPr>
-              <w:t xml:space="preserve">corticosteroid</w:t>
+              <w:t xml:space="preserve">vitamin</w:t>
             </w:r>
           </w:p>
         </w:tc>
@@ -487,7 +487,7 @@
                 <w:rFonts w:ascii="Calibri" w:hAnsi="Calibri"/>
                 <w:sz w:val="20"/>
               </w:rPr>
-              <w:t xml:space="preserve">Anti-inflammatory, Protein of interest (ARF6, CDK5) modulator, Symptomatic relief (ataxia)</w:t>
+              <w:t xml:space="preserve">Protein of interest (LRRK2) modulator</w:t>
             </w:r>
           </w:p>
         </w:tc>
@@ -518,55 +518,55 @@
                 <w:sz w:val="20"/>
                 <w:b w:val="true"/>
               </w:rPr>
-              <w:t xml:space="preserve">Biotin</w:t>
-            </w:r>
-          </w:p>
-        </w:tc>
-        <w:tc>
-          <w:tcPr>
-            <w:tcBorders>
-              <w:top w:val="single" w:space="0" w:color="D3D3D3"/>
-              <w:bottom w:val="single" w:space="0" w:color="D3D3D3"/>
-              <w:start w:val="single" w:space="0" w:color="D3D3D3"/>
-              <w:end w:val="single" w:space="0" w:color="D3D3D3"/>
-            </w:tcBorders>
-          </w:tcPr>
-          <w:p>
-            <w:pPr>
-              <w:spacing w:before="0" w:after="60"/>
-              <w:keepNext/>
-              <w:jc w:val="center"/>
-            </w:pPr>
-            <w:r>
-              <w:rPr>
-                <w:rFonts w:ascii="Calibri" w:hAnsi="Calibri"/>
-                <w:sz w:val="20"/>
-              </w:rPr>
-              <w:t xml:space="preserve">vitamin</w:t>
-            </w:r>
-          </w:p>
-        </w:tc>
-        <w:tc>
-          <w:tcPr>
-            <w:tcBorders>
-              <w:top w:val="single" w:space="0" w:color="D3D3D3"/>
-              <w:bottom w:val="single" w:space="0" w:color="D3D3D3"/>
-              <w:start w:val="single" w:space="0" w:color="D3D3D3"/>
-              <w:end w:val="single" w:space="0" w:color="D3D3D3"/>
-            </w:tcBorders>
-          </w:tcPr>
-          <w:p>
-            <w:pPr>
-              <w:spacing w:before="0" w:after="60"/>
-              <w:keepNext/>
-              <w:jc w:val="center"/>
-            </w:pPr>
-            <w:r>
-              <w:rPr>
-                <w:rFonts w:ascii="Calibri" w:hAnsi="Calibri"/>
-                <w:sz w:val="20"/>
-              </w:rPr>
-              <w:t xml:space="preserve">Protein of interest (LRRK2) modulator</w:t>
+              <w:t xml:space="preserve">Budesonide</w:t>
+            </w:r>
+          </w:p>
+        </w:tc>
+        <w:tc>
+          <w:tcPr>
+            <w:tcBorders>
+              <w:top w:val="single" w:space="0" w:color="D3D3D3"/>
+              <w:bottom w:val="single" w:space="0" w:color="D3D3D3"/>
+              <w:start w:val="single" w:space="0" w:color="D3D3D3"/>
+              <w:end w:val="single" w:space="0" w:color="D3D3D3"/>
+            </w:tcBorders>
+          </w:tcPr>
+          <w:p>
+            <w:pPr>
+              <w:spacing w:before="0" w:after="60"/>
+              <w:keepNext/>
+              <w:jc w:val="center"/>
+            </w:pPr>
+            <w:r>
+              <w:rPr>
+                <w:rFonts w:ascii="Calibri" w:hAnsi="Calibri"/>
+                <w:sz w:val="20"/>
+              </w:rPr>
+              <w:t xml:space="preserve">corticosteroid</w:t>
+            </w:r>
+          </w:p>
+        </w:tc>
+        <w:tc>
+          <w:tcPr>
+            <w:tcBorders>
+              <w:top w:val="single" w:space="0" w:color="D3D3D3"/>
+              <w:bottom w:val="single" w:space="0" w:color="D3D3D3"/>
+              <w:start w:val="single" w:space="0" w:color="D3D3D3"/>
+              <w:end w:val="single" w:space="0" w:color="D3D3D3"/>
+            </w:tcBorders>
+          </w:tcPr>
+          <w:p>
+            <w:pPr>
+              <w:spacing w:before="0" w:after="60"/>
+              <w:keepNext/>
+              <w:jc w:val="center"/>
+            </w:pPr>
+            <w:r>
+              <w:rPr>
+                <w:rFonts w:ascii="Calibri" w:hAnsi="Calibri"/>
+                <w:sz w:val="20"/>
+              </w:rPr>
+              <w:t xml:space="preserve">Anti-inflammatory, Protein of interest (CDK5, LRRK2) modulator</w:t>
             </w:r>
           </w:p>
         </w:tc>
@@ -597,7 +597,7 @@
                 <w:sz w:val="20"/>
                 <w:b w:val="true"/>
               </w:rPr>
-              <w:t xml:space="preserve">Budesonide</w:t>
+              <w:t xml:space="preserve">Buspirone</w:t>
             </w:r>
           </w:p>
         </w:tc>
@@ -622,7 +622,7 @@
                 <w:rFonts w:ascii="Calibri" w:hAnsi="Calibri"/>
                 <w:sz w:val="20"/>
               </w:rPr>
-              <w:t xml:space="preserve">corticosteroid</w:t>
+              <w:t xml:space="preserve">anxiolytic</w:t>
             </w:r>
           </w:p>
         </w:tc>
@@ -647,7 +647,7 @@
                 <w:rFonts w:ascii="Calibri" w:hAnsi="Calibri"/>
                 <w:sz w:val="20"/>
               </w:rPr>
-              <w:t xml:space="preserve">Anti-inflammatory, Protein of interest (CDK5, LRRK2) modulator</w:t>
+              <w:t xml:space="preserve">Increase neurotransmitter signaling, Protein of interest (DRD1) modulator, Symptomatic relief (spasticity)</w:t>
             </w:r>
           </w:p>
         </w:tc>
@@ -678,55 +678,55 @@
                 <w:sz w:val="20"/>
                 <w:b w:val="true"/>
               </w:rPr>
-              <w:t xml:space="preserve">Buspirone</w:t>
-            </w:r>
-          </w:p>
-        </w:tc>
-        <w:tc>
-          <w:tcPr>
-            <w:tcBorders>
-              <w:top w:val="single" w:space="0" w:color="D3D3D3"/>
-              <w:bottom w:val="single" w:space="0" w:color="D3D3D3"/>
-              <w:start w:val="single" w:space="0" w:color="D3D3D3"/>
-              <w:end w:val="single" w:space="0" w:color="D3D3D3"/>
-            </w:tcBorders>
-          </w:tcPr>
-          <w:p>
-            <w:pPr>
-              <w:spacing w:before="0" w:after="60"/>
-              <w:keepNext/>
-              <w:jc w:val="center"/>
-            </w:pPr>
-            <w:r>
-              <w:rPr>
-                <w:rFonts w:ascii="Calibri" w:hAnsi="Calibri"/>
-                <w:sz w:val="20"/>
-              </w:rPr>
-              <w:t xml:space="preserve">anxiolytic</w:t>
-            </w:r>
-          </w:p>
-        </w:tc>
-        <w:tc>
-          <w:tcPr>
-            <w:tcBorders>
-              <w:top w:val="single" w:space="0" w:color="D3D3D3"/>
-              <w:bottom w:val="single" w:space="0" w:color="D3D3D3"/>
-              <w:start w:val="single" w:space="0" w:color="D3D3D3"/>
-              <w:end w:val="single" w:space="0" w:color="D3D3D3"/>
-            </w:tcBorders>
-          </w:tcPr>
-          <w:p>
-            <w:pPr>
-              <w:spacing w:before="0" w:after="60"/>
-              <w:keepNext/>
-              <w:jc w:val="center"/>
-            </w:pPr>
-            <w:r>
-              <w:rPr>
-                <w:rFonts w:ascii="Calibri" w:hAnsi="Calibri"/>
-                <w:sz w:val="20"/>
-              </w:rPr>
-              <w:t xml:space="preserve">Increase neurotransmitter signaling, Protein of interest (DRD1) modulator, Symptomatic relief (spasticity)</w:t>
+              <w:t xml:space="preserve">Citalopram</w:t>
+            </w:r>
+          </w:p>
+        </w:tc>
+        <w:tc>
+          <w:tcPr>
+            <w:tcBorders>
+              <w:top w:val="single" w:space="0" w:color="D3D3D3"/>
+              <w:bottom w:val="single" w:space="0" w:color="D3D3D3"/>
+              <w:start w:val="single" w:space="0" w:color="D3D3D3"/>
+              <w:end w:val="single" w:space="0" w:color="D3D3D3"/>
+            </w:tcBorders>
+          </w:tcPr>
+          <w:p>
+            <w:pPr>
+              <w:spacing w:before="0" w:after="60"/>
+              <w:keepNext/>
+              <w:jc w:val="center"/>
+            </w:pPr>
+            <w:r>
+              <w:rPr>
+                <w:rFonts w:ascii="Calibri" w:hAnsi="Calibri"/>
+                <w:sz w:val="20"/>
+              </w:rPr>
+              <w:t xml:space="preserve">SSRI</w:t>
+            </w:r>
+          </w:p>
+        </w:tc>
+        <w:tc>
+          <w:tcPr>
+            <w:tcBorders>
+              <w:top w:val="single" w:space="0" w:color="D3D3D3"/>
+              <w:bottom w:val="single" w:space="0" w:color="D3D3D3"/>
+              <w:start w:val="single" w:space="0" w:color="D3D3D3"/>
+              <w:end w:val="single" w:space="0" w:color="D3D3D3"/>
+            </w:tcBorders>
+          </w:tcPr>
+          <w:p>
+            <w:pPr>
+              <w:spacing w:before="0" w:after="60"/>
+              <w:keepNext/>
+              <w:jc w:val="center"/>
+            </w:pPr>
+            <w:r>
+              <w:rPr>
+                <w:rFonts w:ascii="Calibri" w:hAnsi="Calibri"/>
+                <w:sz w:val="20"/>
+              </w:rPr>
+              <w:t xml:space="preserve">Increase neuroplasticity, Increase neurotransmitter signaling</w:t>
             </w:r>
           </w:p>
         </w:tc>
@@ -757,7 +757,7 @@
                 <w:sz w:val="20"/>
                 <w:b w:val="true"/>
               </w:rPr>
-              <w:t xml:space="preserve">Citalopram</w:t>
+              <w:t xml:space="preserve">Clonidine</w:t>
             </w:r>
           </w:p>
         </w:tc>
@@ -782,7 +782,7 @@
                 <w:rFonts w:ascii="Calibri" w:hAnsi="Calibri"/>
                 <w:sz w:val="20"/>
               </w:rPr>
-              <w:t xml:space="preserve">SSRI</w:t>
+              <w:t xml:space="preserve">sedative</w:t>
             </w:r>
           </w:p>
         </w:tc>
@@ -807,7 +807,7 @@
                 <w:rFonts w:ascii="Calibri" w:hAnsi="Calibri"/>
                 <w:sz w:val="20"/>
               </w:rPr>
-              <w:t xml:space="preserve">Increase neuroplasticity, Increase neurotransmitter signaling</w:t>
+              <w:t xml:space="preserve">Symptomatic relief (spasticity)</w:t>
             </w:r>
           </w:p>
         </w:tc>
@@ -838,55 +838,55 @@
                 <w:sz w:val="20"/>
                 <w:b w:val="true"/>
               </w:rPr>
-              <w:t xml:space="preserve">Clonidine</w:t>
-            </w:r>
-          </w:p>
-        </w:tc>
-        <w:tc>
-          <w:tcPr>
-            <w:tcBorders>
-              <w:top w:val="single" w:space="0" w:color="D3D3D3"/>
-              <w:bottom w:val="single" w:space="0" w:color="D3D3D3"/>
-              <w:start w:val="single" w:space="0" w:color="D3D3D3"/>
-              <w:end w:val="single" w:space="0" w:color="D3D3D3"/>
-            </w:tcBorders>
-          </w:tcPr>
-          <w:p>
-            <w:pPr>
-              <w:spacing w:before="0" w:after="60"/>
-              <w:keepNext/>
-              <w:jc w:val="center"/>
-            </w:pPr>
-            <w:r>
-              <w:rPr>
-                <w:rFonts w:ascii="Calibri" w:hAnsi="Calibri"/>
-                <w:sz w:val="20"/>
-              </w:rPr>
-              <w:t xml:space="preserve">sedative</w:t>
-            </w:r>
-          </w:p>
-        </w:tc>
-        <w:tc>
-          <w:tcPr>
-            <w:tcBorders>
-              <w:top w:val="single" w:space="0" w:color="D3D3D3"/>
-              <w:bottom w:val="single" w:space="0" w:color="D3D3D3"/>
-              <w:start w:val="single" w:space="0" w:color="D3D3D3"/>
-              <w:end w:val="single" w:space="0" w:color="D3D3D3"/>
-            </w:tcBorders>
-          </w:tcPr>
-          <w:p>
-            <w:pPr>
-              <w:spacing w:before="0" w:after="60"/>
-              <w:keepNext/>
-              <w:jc w:val="center"/>
-            </w:pPr>
-            <w:r>
-              <w:rPr>
-                <w:rFonts w:ascii="Calibri" w:hAnsi="Calibri"/>
-                <w:sz w:val="20"/>
-              </w:rPr>
-              <w:t xml:space="preserve">Symptomatic relief (spasticity)</w:t>
+              <w:t xml:space="preserve">Cyproheptadine</w:t>
+            </w:r>
+          </w:p>
+        </w:tc>
+        <w:tc>
+          <w:tcPr>
+            <w:tcBorders>
+              <w:top w:val="single" w:space="0" w:color="D3D3D3"/>
+              <w:bottom w:val="single" w:space="0" w:color="D3D3D3"/>
+              <w:start w:val="single" w:space="0" w:color="D3D3D3"/>
+              <w:end w:val="single" w:space="0" w:color="D3D3D3"/>
+            </w:tcBorders>
+          </w:tcPr>
+          <w:p>
+            <w:pPr>
+              <w:spacing w:before="0" w:after="60"/>
+              <w:keepNext/>
+              <w:jc w:val="center"/>
+            </w:pPr>
+            <w:r>
+              <w:rPr>
+                <w:rFonts w:ascii="Calibri" w:hAnsi="Calibri"/>
+                <w:sz w:val="20"/>
+              </w:rPr>
+              <w:t xml:space="preserve">antihistamine</w:t>
+            </w:r>
+          </w:p>
+        </w:tc>
+        <w:tc>
+          <w:tcPr>
+            <w:tcBorders>
+              <w:top w:val="single" w:space="0" w:color="D3D3D3"/>
+              <w:bottom w:val="single" w:space="0" w:color="D3D3D3"/>
+              <w:start w:val="single" w:space="0" w:color="D3D3D3"/>
+              <w:end w:val="single" w:space="0" w:color="D3D3D3"/>
+            </w:tcBorders>
+          </w:tcPr>
+          <w:p>
+            <w:pPr>
+              <w:spacing w:before="0" w:after="60"/>
+              <w:keepNext/>
+              <w:jc w:val="center"/>
+            </w:pPr>
+            <w:r>
+              <w:rPr>
+                <w:rFonts w:ascii="Calibri" w:hAnsi="Calibri"/>
+                <w:sz w:val="20"/>
+              </w:rPr>
+              <w:t xml:space="preserve">Symptomatic relief (dystonia)</w:t>
             </w:r>
           </w:p>
         </w:tc>
@@ -917,7 +917,7 @@
                 <w:sz w:val="20"/>
                 <w:b w:val="true"/>
               </w:rPr>
-              <w:t xml:space="preserve">Cyproheptadine</w:t>
+              <w:t xml:space="preserve">Dantrolene</w:t>
             </w:r>
           </w:p>
         </w:tc>
@@ -942,7 +942,7 @@
                 <w:rFonts w:ascii="Calibri" w:hAnsi="Calibri"/>
                 <w:sz w:val="20"/>
               </w:rPr>
-              <w:t xml:space="preserve">antihistamine</w:t>
+              <w:t xml:space="preserve">muscle relaxant</w:t>
             </w:r>
           </w:p>
         </w:tc>
@@ -967,7 +967,7 @@
                 <w:rFonts w:ascii="Calibri" w:hAnsi="Calibri"/>
                 <w:sz w:val="20"/>
               </w:rPr>
-              <w:t xml:space="preserve">Symptomatic relief (dystonia)</w:t>
+              <w:t xml:space="preserve">Symptomatic relief (spasticity)</w:t>
             </w:r>
           </w:p>
         </w:tc>
@@ -998,55 +998,55 @@
                 <w:sz w:val="20"/>
                 <w:b w:val="true"/>
               </w:rPr>
-              <w:t xml:space="preserve">Dantrolene</w:t>
-            </w:r>
-          </w:p>
-        </w:tc>
-        <w:tc>
-          <w:tcPr>
-            <w:tcBorders>
-              <w:top w:val="single" w:space="0" w:color="D3D3D3"/>
-              <w:bottom w:val="single" w:space="0" w:color="D3D3D3"/>
-              <w:start w:val="single" w:space="0" w:color="D3D3D3"/>
-              <w:end w:val="single" w:space="0" w:color="D3D3D3"/>
-            </w:tcBorders>
-          </w:tcPr>
-          <w:p>
-            <w:pPr>
-              <w:spacing w:before="0" w:after="60"/>
-              <w:keepNext/>
-              <w:jc w:val="center"/>
-            </w:pPr>
-            <w:r>
-              <w:rPr>
-                <w:rFonts w:ascii="Calibri" w:hAnsi="Calibri"/>
-                <w:sz w:val="20"/>
-              </w:rPr>
-              <w:t xml:space="preserve">muscle relaxant</w:t>
-            </w:r>
-          </w:p>
-        </w:tc>
-        <w:tc>
-          <w:tcPr>
-            <w:tcBorders>
-              <w:top w:val="single" w:space="0" w:color="D3D3D3"/>
-              <w:bottom w:val="single" w:space="0" w:color="D3D3D3"/>
-              <w:start w:val="single" w:space="0" w:color="D3D3D3"/>
-              <w:end w:val="single" w:space="0" w:color="D3D3D3"/>
-            </w:tcBorders>
-          </w:tcPr>
-          <w:p>
-            <w:pPr>
-              <w:spacing w:before="0" w:after="60"/>
-              <w:keepNext/>
-              <w:jc w:val="center"/>
-            </w:pPr>
-            <w:r>
-              <w:rPr>
-                <w:rFonts w:ascii="Calibri" w:hAnsi="Calibri"/>
-                <w:sz w:val="20"/>
-              </w:rPr>
-              <w:t xml:space="preserve">Symptomatic relief (spasticity)</w:t>
+              <w:t xml:space="preserve">Desvenlafaxine</w:t>
+            </w:r>
+          </w:p>
+        </w:tc>
+        <w:tc>
+          <w:tcPr>
+            <w:tcBorders>
+              <w:top w:val="single" w:space="0" w:color="D3D3D3"/>
+              <w:bottom w:val="single" w:space="0" w:color="D3D3D3"/>
+              <w:start w:val="single" w:space="0" w:color="D3D3D3"/>
+              <w:end w:val="single" w:space="0" w:color="D3D3D3"/>
+            </w:tcBorders>
+          </w:tcPr>
+          <w:p>
+            <w:pPr>
+              <w:spacing w:before="0" w:after="60"/>
+              <w:keepNext/>
+              <w:jc w:val="center"/>
+            </w:pPr>
+            <w:r>
+              <w:rPr>
+                <w:rFonts w:ascii="Calibri" w:hAnsi="Calibri"/>
+                <w:sz w:val="20"/>
+              </w:rPr>
+              <w:t xml:space="preserve">SNRI</w:t>
+            </w:r>
+          </w:p>
+        </w:tc>
+        <w:tc>
+          <w:tcPr>
+            <w:tcBorders>
+              <w:top w:val="single" w:space="0" w:color="D3D3D3"/>
+              <w:bottom w:val="single" w:space="0" w:color="D3D3D3"/>
+              <w:start w:val="single" w:space="0" w:color="D3D3D3"/>
+              <w:end w:val="single" w:space="0" w:color="D3D3D3"/>
+            </w:tcBorders>
+          </w:tcPr>
+          <w:p>
+            <w:pPr>
+              <w:spacing w:before="0" w:after="60"/>
+              <w:keepNext/>
+              <w:jc w:val="center"/>
+            </w:pPr>
+            <w:r>
+              <w:rPr>
+                <w:rFonts w:ascii="Calibri" w:hAnsi="Calibri"/>
+                <w:sz w:val="20"/>
+              </w:rPr>
+              <w:t xml:space="preserve">Increase neurotransmitter signaling</w:t>
             </w:r>
           </w:p>
         </w:tc>
@@ -1077,7 +1077,7 @@
                 <w:sz w:val="20"/>
                 <w:b w:val="true"/>
               </w:rPr>
-              <w:t xml:space="preserve">Desvenlafaxine</w:t>
+              <w:t xml:space="preserve">Escitalopram</w:t>
             </w:r>
           </w:p>
         </w:tc>
@@ -1102,7 +1102,7 @@
                 <w:rFonts w:ascii="Calibri" w:hAnsi="Calibri"/>
                 <w:sz w:val="20"/>
               </w:rPr>
-              <w:t xml:space="preserve">SNRI</w:t>
+              <w:t xml:space="preserve">SSRI</w:t>
             </w:r>
           </w:p>
         </w:tc>
@@ -1127,7 +1127,7 @@
                 <w:rFonts w:ascii="Calibri" w:hAnsi="Calibri"/>
                 <w:sz w:val="20"/>
               </w:rPr>
-              <w:t xml:space="preserve">Increase neurotransmitter signaling</w:t>
+              <w:t xml:space="preserve">Increase neurotransmitter signaling, Protein of interest (SPAG9) modulator</w:t>
             </w:r>
           </w:p>
         </w:tc>
@@ -1158,7 +1158,7 @@
                 <w:sz w:val="20"/>
                 <w:b w:val="true"/>
               </w:rPr>
-              <w:t xml:space="preserve">Escitalopram</w:t>
+              <w:t xml:space="preserve">Fluvoxamine</w:t>
             </w:r>
           </w:p>
         </w:tc>
@@ -1206,7 +1206,7 @@
                 <w:rFonts w:ascii="Calibri" w:hAnsi="Calibri"/>
                 <w:sz w:val="20"/>
               </w:rPr>
-              <w:t xml:space="preserve">Increase neurotransmitter signaling, Protein of interest (SPAG9) modulator</w:t>
+              <w:t xml:space="preserve">Increase neurotransmitter signaling, Protein of interest (ARF6, NTRK2) modulator</w:t>
             </w:r>
           </w:p>
         </w:tc>
@@ -1237,7 +1237,7 @@
                 <w:sz w:val="20"/>
                 <w:b w:val="true"/>
               </w:rPr>
-              <w:t xml:space="preserve">Fluvoxamine</w:t>
+              <w:t xml:space="preserve">Gabapentin</w:t>
             </w:r>
           </w:p>
         </w:tc>
@@ -1262,7 +1262,7 @@
                 <w:rFonts w:ascii="Calibri" w:hAnsi="Calibri"/>
                 <w:sz w:val="20"/>
               </w:rPr>
-              <w:t xml:space="preserve">SSRI</w:t>
+              <w:t xml:space="preserve">anticonvulsant</w:t>
             </w:r>
           </w:p>
         </w:tc>
@@ -1287,7 +1287,7 @@
                 <w:rFonts w:ascii="Calibri" w:hAnsi="Calibri"/>
                 <w:sz w:val="20"/>
               </w:rPr>
-              <w:t xml:space="preserve">Increase neurotransmitter signaling, Protein of interest (ARF6, NTRK2) modulator</w:t>
+              <w:t xml:space="preserve">Increase neurotransmitter signaling</w:t>
             </w:r>
           </w:p>
         </w:tc>
@@ -1318,55 +1318,55 @@
                 <w:sz w:val="20"/>
                 <w:b w:val="true"/>
               </w:rPr>
-              <w:t xml:space="preserve">Gabapentin</w:t>
-            </w:r>
-          </w:p>
-        </w:tc>
-        <w:tc>
-          <w:tcPr>
-            <w:tcBorders>
-              <w:top w:val="single" w:space="0" w:color="D3D3D3"/>
-              <w:bottom w:val="single" w:space="0" w:color="D3D3D3"/>
-              <w:start w:val="single" w:space="0" w:color="D3D3D3"/>
-              <w:end w:val="single" w:space="0" w:color="D3D3D3"/>
-            </w:tcBorders>
-          </w:tcPr>
-          <w:p>
-            <w:pPr>
-              <w:spacing w:before="0" w:after="60"/>
-              <w:keepNext/>
-              <w:jc w:val="center"/>
-            </w:pPr>
-            <w:r>
-              <w:rPr>
-                <w:rFonts w:ascii="Calibri" w:hAnsi="Calibri"/>
-                <w:sz w:val="20"/>
-              </w:rPr>
-              <w:t xml:space="preserve">anticonvulsant</w:t>
-            </w:r>
-          </w:p>
-        </w:tc>
-        <w:tc>
-          <w:tcPr>
-            <w:tcBorders>
-              <w:top w:val="single" w:space="0" w:color="D3D3D3"/>
-              <w:bottom w:val="single" w:space="0" w:color="D3D3D3"/>
-              <w:start w:val="single" w:space="0" w:color="D3D3D3"/>
-              <w:end w:val="single" w:space="0" w:color="D3D3D3"/>
-            </w:tcBorders>
-          </w:tcPr>
-          <w:p>
-            <w:pPr>
-              <w:spacing w:before="0" w:after="60"/>
-              <w:keepNext/>
-              <w:jc w:val="center"/>
-            </w:pPr>
-            <w:r>
-              <w:rPr>
-                <w:rFonts w:ascii="Calibri" w:hAnsi="Calibri"/>
-                <w:sz w:val="20"/>
-              </w:rPr>
-              <w:t xml:space="preserve">Increase neurotransmitter signaling</w:t>
+              <w:t xml:space="preserve">Glutamic acid</w:t>
+            </w:r>
+          </w:p>
+        </w:tc>
+        <w:tc>
+          <w:tcPr>
+            <w:tcBorders>
+              <w:top w:val="single" w:space="0" w:color="D3D3D3"/>
+              <w:bottom w:val="single" w:space="0" w:color="D3D3D3"/>
+              <w:start w:val="single" w:space="0" w:color="D3D3D3"/>
+              <w:end w:val="single" w:space="0" w:color="D3D3D3"/>
+            </w:tcBorders>
+          </w:tcPr>
+          <w:p>
+            <w:pPr>
+              <w:spacing w:before="0" w:after="60"/>
+              <w:keepNext/>
+              <w:jc w:val="center"/>
+            </w:pPr>
+            <w:r>
+              <w:rPr>
+                <w:rFonts w:ascii="Calibri" w:hAnsi="Calibri"/>
+                <w:sz w:val="20"/>
+              </w:rPr>
+              <w:t xml:space="preserve">neurotransmitter</w:t>
+            </w:r>
+          </w:p>
+        </w:tc>
+        <w:tc>
+          <w:tcPr>
+            <w:tcBorders>
+              <w:top w:val="single" w:space="0" w:color="D3D3D3"/>
+              <w:bottom w:val="single" w:space="0" w:color="D3D3D3"/>
+              <w:start w:val="single" w:space="0" w:color="D3D3D3"/>
+              <w:end w:val="single" w:space="0" w:color="D3D3D3"/>
+            </w:tcBorders>
+          </w:tcPr>
+          <w:p>
+            <w:pPr>
+              <w:spacing w:before="0" w:after="60"/>
+              <w:keepNext/>
+              <w:jc w:val="center"/>
+            </w:pPr>
+            <w:r>
+              <w:rPr>
+                <w:rFonts w:ascii="Calibri" w:hAnsi="Calibri"/>
+                <w:sz w:val="20"/>
+              </w:rPr>
+              <w:t xml:space="preserve">Increase neurotransmitter signaling, Protein of interest (LRRK2, NTRK2) modulator</w:t>
             </w:r>
           </w:p>
         </w:tc>
@@ -1397,7 +1397,7 @@
                 <w:sz w:val="20"/>
                 <w:b w:val="true"/>
               </w:rPr>
-              <w:t xml:space="preserve">Glutamic acid</w:t>
+              <w:t xml:space="preserve">Loratadine</w:t>
             </w:r>
           </w:p>
         </w:tc>
@@ -1422,7 +1422,7 @@
                 <w:rFonts w:ascii="Calibri" w:hAnsi="Calibri"/>
                 <w:sz w:val="20"/>
               </w:rPr>
-              <w:t xml:space="preserve">neurotransmitter</w:t>
+              <w:t xml:space="preserve">antihistamine</w:t>
             </w:r>
           </w:p>
         </w:tc>
@@ -1447,7 +1447,7 @@
                 <w:rFonts w:ascii="Calibri" w:hAnsi="Calibri"/>
                 <w:sz w:val="20"/>
               </w:rPr>
-              <w:t xml:space="preserve">Increase neurotransmitter signaling, Protein of interest (LRRK2, NTRK2) modulator</w:t>
+              <w:t xml:space="preserve">Protein of interest (MTOR) modulator</w:t>
             </w:r>
           </w:p>
         </w:tc>
@@ -1478,55 +1478,55 @@
                 <w:sz w:val="20"/>
                 <w:b w:val="true"/>
               </w:rPr>
-              <w:t xml:space="preserve">Loratadine</w:t>
-            </w:r>
-          </w:p>
-        </w:tc>
-        <w:tc>
-          <w:tcPr>
-            <w:tcBorders>
-              <w:top w:val="single" w:space="0" w:color="D3D3D3"/>
-              <w:bottom w:val="single" w:space="0" w:color="D3D3D3"/>
-              <w:start w:val="single" w:space="0" w:color="D3D3D3"/>
-              <w:end w:val="single" w:space="0" w:color="D3D3D3"/>
-            </w:tcBorders>
-          </w:tcPr>
-          <w:p>
-            <w:pPr>
-              <w:spacing w:before="0" w:after="60"/>
-              <w:keepNext/>
-              <w:jc w:val="center"/>
-            </w:pPr>
-            <w:r>
-              <w:rPr>
-                <w:rFonts w:ascii="Calibri" w:hAnsi="Calibri"/>
-                <w:sz w:val="20"/>
-              </w:rPr>
-              <w:t xml:space="preserve">antihistamine</w:t>
-            </w:r>
-          </w:p>
-        </w:tc>
-        <w:tc>
-          <w:tcPr>
-            <w:tcBorders>
-              <w:top w:val="single" w:space="0" w:color="D3D3D3"/>
-              <w:bottom w:val="single" w:space="0" w:color="D3D3D3"/>
-              <w:start w:val="single" w:space="0" w:color="D3D3D3"/>
-              <w:end w:val="single" w:space="0" w:color="D3D3D3"/>
-            </w:tcBorders>
-          </w:tcPr>
-          <w:p>
-            <w:pPr>
-              <w:spacing w:before="0" w:after="60"/>
-              <w:keepNext/>
-              <w:jc w:val="center"/>
-            </w:pPr>
-            <w:r>
-              <w:rPr>
-                <w:rFonts w:ascii="Calibri" w:hAnsi="Calibri"/>
-                <w:sz w:val="20"/>
-              </w:rPr>
-              <w:t xml:space="preserve">Protein of interest (MTOR) modulator</w:t>
+              <w:t xml:space="preserve">Lovastatin</w:t>
+            </w:r>
+          </w:p>
+        </w:tc>
+        <w:tc>
+          <w:tcPr>
+            <w:tcBorders>
+              <w:top w:val="single" w:space="0" w:color="D3D3D3"/>
+              <w:bottom w:val="single" w:space="0" w:color="D3D3D3"/>
+              <w:start w:val="single" w:space="0" w:color="D3D3D3"/>
+              <w:end w:val="single" w:space="0" w:color="D3D3D3"/>
+            </w:tcBorders>
+          </w:tcPr>
+          <w:p>
+            <w:pPr>
+              <w:spacing w:before="0" w:after="60"/>
+              <w:keepNext/>
+              <w:jc w:val="center"/>
+            </w:pPr>
+            <w:r>
+              <w:rPr>
+                <w:rFonts w:ascii="Calibri" w:hAnsi="Calibri"/>
+                <w:sz w:val="20"/>
+              </w:rPr>
+              <w:t xml:space="preserve">statin</w:t>
+            </w:r>
+          </w:p>
+        </w:tc>
+        <w:tc>
+          <w:tcPr>
+            <w:tcBorders>
+              <w:top w:val="single" w:space="0" w:color="D3D3D3"/>
+              <w:bottom w:val="single" w:space="0" w:color="D3D3D3"/>
+              <w:start w:val="single" w:space="0" w:color="D3D3D3"/>
+              <w:end w:val="single" w:space="0" w:color="D3D3D3"/>
+            </w:tcBorders>
+          </w:tcPr>
+          <w:p>
+            <w:pPr>
+              <w:spacing w:before="0" w:after="60"/>
+              <w:keepNext/>
+              <w:jc w:val="center"/>
+            </w:pPr>
+            <w:r>
+              <w:rPr>
+                <w:rFonts w:ascii="Calibri" w:hAnsi="Calibri"/>
+                <w:sz w:val="20"/>
+              </w:rPr>
+              <w:t xml:space="preserve">Protein of interest (ARF6, DRD1, JNK, LRRK2, NTRK2) modulator</w:t>
             </w:r>
           </w:p>
         </w:tc>
@@ -1557,7 +1557,7 @@
                 <w:sz w:val="20"/>
                 <w:b w:val="true"/>
               </w:rPr>
-              <w:t xml:space="preserve">Lovastatin</w:t>
+              <w:t xml:space="preserve">Metformin</w:t>
             </w:r>
           </w:p>
         </w:tc>
@@ -1582,7 +1582,7 @@
                 <w:rFonts w:ascii="Calibri" w:hAnsi="Calibri"/>
                 <w:sz w:val="20"/>
               </w:rPr>
-              <w:t xml:space="preserve">statin</w:t>
+              <w:t xml:space="preserve">antidiabetic</w:t>
             </w:r>
           </w:p>
         </w:tc>
@@ -1607,7 +1607,7 @@
                 <w:rFonts w:ascii="Calibri" w:hAnsi="Calibri"/>
                 <w:sz w:val="20"/>
               </w:rPr>
-              <w:t xml:space="preserve">Protein of interest (ARF6, DRD1, JNK, LRRK2, NTRK2) modulator</w:t>
+              <w:t xml:space="preserve">Anti-inflammatory</w:t>
             </w:r>
           </w:p>
         </w:tc>
@@ -1638,55 +1638,55 @@
                 <w:sz w:val="20"/>
                 <w:b w:val="true"/>
               </w:rPr>
-              <w:t xml:space="preserve">Metformin</w:t>
-            </w:r>
-          </w:p>
-        </w:tc>
-        <w:tc>
-          <w:tcPr>
-            <w:tcBorders>
-              <w:top w:val="single" w:space="0" w:color="D3D3D3"/>
-              <w:bottom w:val="single" w:space="0" w:color="D3D3D3"/>
-              <w:start w:val="single" w:space="0" w:color="D3D3D3"/>
-              <w:end w:val="single" w:space="0" w:color="D3D3D3"/>
-            </w:tcBorders>
-          </w:tcPr>
-          <w:p>
-            <w:pPr>
-              <w:spacing w:before="0" w:after="60"/>
-              <w:keepNext/>
-              <w:jc w:val="center"/>
-            </w:pPr>
-            <w:r>
-              <w:rPr>
-                <w:rFonts w:ascii="Calibri" w:hAnsi="Calibri"/>
-                <w:sz w:val="20"/>
-              </w:rPr>
-              <w:t xml:space="preserve">antidiabetic</w:t>
-            </w:r>
-          </w:p>
-        </w:tc>
-        <w:tc>
-          <w:tcPr>
-            <w:tcBorders>
-              <w:top w:val="single" w:space="0" w:color="D3D3D3"/>
-              <w:bottom w:val="single" w:space="0" w:color="D3D3D3"/>
-              <w:start w:val="single" w:space="0" w:color="D3D3D3"/>
-              <w:end w:val="single" w:space="0" w:color="D3D3D3"/>
-            </w:tcBorders>
-          </w:tcPr>
-          <w:p>
-            <w:pPr>
-              <w:spacing w:before="0" w:after="60"/>
-              <w:keepNext/>
-              <w:jc w:val="center"/>
-            </w:pPr>
-            <w:r>
-              <w:rPr>
-                <w:rFonts w:ascii="Calibri" w:hAnsi="Calibri"/>
-                <w:sz w:val="20"/>
-              </w:rPr>
-              <w:t xml:space="preserve">Anti-inflammatory</w:t>
+              <w:t xml:space="preserve">Metoprolol</w:t>
+            </w:r>
+          </w:p>
+        </w:tc>
+        <w:tc>
+          <w:tcPr>
+            <w:tcBorders>
+              <w:top w:val="single" w:space="0" w:color="D3D3D3"/>
+              <w:bottom w:val="single" w:space="0" w:color="D3D3D3"/>
+              <w:start w:val="single" w:space="0" w:color="D3D3D3"/>
+              <w:end w:val="single" w:space="0" w:color="D3D3D3"/>
+            </w:tcBorders>
+          </w:tcPr>
+          <w:p>
+            <w:pPr>
+              <w:spacing w:before="0" w:after="60"/>
+              <w:keepNext/>
+              <w:jc w:val="center"/>
+            </w:pPr>
+            <w:r>
+              <w:rPr>
+                <w:rFonts w:ascii="Calibri" w:hAnsi="Calibri"/>
+                <w:sz w:val="20"/>
+              </w:rPr>
+              <w:t xml:space="preserve">beta blocker</w:t>
+            </w:r>
+          </w:p>
+        </w:tc>
+        <w:tc>
+          <w:tcPr>
+            <w:tcBorders>
+              <w:top w:val="single" w:space="0" w:color="D3D3D3"/>
+              <w:bottom w:val="single" w:space="0" w:color="D3D3D3"/>
+              <w:start w:val="single" w:space="0" w:color="D3D3D3"/>
+              <w:end w:val="single" w:space="0" w:color="D3D3D3"/>
+            </w:tcBorders>
+          </w:tcPr>
+          <w:p>
+            <w:pPr>
+              <w:spacing w:before="0" w:after="60"/>
+              <w:keepNext/>
+              <w:jc w:val="center"/>
+            </w:pPr>
+            <w:r>
+              <w:rPr>
+                <w:rFonts w:ascii="Calibri" w:hAnsi="Calibri"/>
+                <w:sz w:val="20"/>
+              </w:rPr>
+              <w:t xml:space="preserve">Symptomatic relief (movement disorder)</w:t>
             </w:r>
           </w:p>
         </w:tc>
@@ -1717,7 +1717,7 @@
                 <w:sz w:val="20"/>
                 <w:b w:val="true"/>
               </w:rPr>
-              <w:t xml:space="preserve">Metoprolol</w:t>
+              <w:t xml:space="preserve">Oseltamivir</w:t>
             </w:r>
           </w:p>
         </w:tc>
@@ -1742,7 +1742,7 @@
                 <w:rFonts w:ascii="Calibri" w:hAnsi="Calibri"/>
                 <w:sz w:val="20"/>
               </w:rPr>
-              <w:t xml:space="preserve">beta blocker</w:t>
+              <w:t xml:space="preserve">antiviral</w:t>
             </w:r>
           </w:p>
         </w:tc>
@@ -1767,7 +1767,7 @@
                 <w:rFonts w:ascii="Calibri" w:hAnsi="Calibri"/>
                 <w:sz w:val="20"/>
               </w:rPr>
-              <w:t xml:space="preserve">Symptomatic relief (movement disorder)</w:t>
+              <w:t xml:space="preserve">Anti-microbial, Protein of interest (NTRK2) modulator</w:t>
             </w:r>
           </w:p>
         </w:tc>
@@ -1798,55 +1798,55 @@
                 <w:sz w:val="20"/>
                 <w:b w:val="true"/>
               </w:rPr>
-              <w:t xml:space="preserve">Oseltamivir</w:t>
-            </w:r>
-          </w:p>
-        </w:tc>
-        <w:tc>
-          <w:tcPr>
-            <w:tcBorders>
-              <w:top w:val="single" w:space="0" w:color="D3D3D3"/>
-              <w:bottom w:val="single" w:space="0" w:color="D3D3D3"/>
-              <w:start w:val="single" w:space="0" w:color="D3D3D3"/>
-              <w:end w:val="single" w:space="0" w:color="D3D3D3"/>
-            </w:tcBorders>
-          </w:tcPr>
-          <w:p>
-            <w:pPr>
-              <w:spacing w:before="0" w:after="60"/>
-              <w:keepNext/>
-              <w:jc w:val="center"/>
-            </w:pPr>
-            <w:r>
-              <w:rPr>
-                <w:rFonts w:ascii="Calibri" w:hAnsi="Calibri"/>
-                <w:sz w:val="20"/>
-              </w:rPr>
-              <w:t xml:space="preserve">antiviral</w:t>
-            </w:r>
-          </w:p>
-        </w:tc>
-        <w:tc>
-          <w:tcPr>
-            <w:tcBorders>
-              <w:top w:val="single" w:space="0" w:color="D3D3D3"/>
-              <w:bottom w:val="single" w:space="0" w:color="D3D3D3"/>
-              <w:start w:val="single" w:space="0" w:color="D3D3D3"/>
-              <w:end w:val="single" w:space="0" w:color="D3D3D3"/>
-            </w:tcBorders>
-          </w:tcPr>
-          <w:p>
-            <w:pPr>
-              <w:spacing w:before="0" w:after="60"/>
-              <w:keepNext/>
-              <w:jc w:val="center"/>
-            </w:pPr>
-            <w:r>
-              <w:rPr>
-                <w:rFonts w:ascii="Calibri" w:hAnsi="Calibri"/>
-                <w:sz w:val="20"/>
-              </w:rPr>
-              <w:t xml:space="preserve">Anti-microbial, Protein of interest (NTRK2) modulator</w:t>
+              <w:t xml:space="preserve">Propranolol</w:t>
+            </w:r>
+          </w:p>
+        </w:tc>
+        <w:tc>
+          <w:tcPr>
+            <w:tcBorders>
+              <w:top w:val="single" w:space="0" w:color="D3D3D3"/>
+              <w:bottom w:val="single" w:space="0" w:color="D3D3D3"/>
+              <w:start w:val="single" w:space="0" w:color="D3D3D3"/>
+              <w:end w:val="single" w:space="0" w:color="D3D3D3"/>
+            </w:tcBorders>
+          </w:tcPr>
+          <w:p>
+            <w:pPr>
+              <w:spacing w:before="0" w:after="60"/>
+              <w:keepNext/>
+              <w:jc w:val="center"/>
+            </w:pPr>
+            <w:r>
+              <w:rPr>
+                <w:rFonts w:ascii="Calibri" w:hAnsi="Calibri"/>
+                <w:sz w:val="20"/>
+              </w:rPr>
+              <w:t xml:space="preserve">beta blocker</w:t>
+            </w:r>
+          </w:p>
+        </w:tc>
+        <w:tc>
+          <w:tcPr>
+            <w:tcBorders>
+              <w:top w:val="single" w:space="0" w:color="D3D3D3"/>
+              <w:bottom w:val="single" w:space="0" w:color="D3D3D3"/>
+              <w:start w:val="single" w:space="0" w:color="D3D3D3"/>
+              <w:end w:val="single" w:space="0" w:color="D3D3D3"/>
+            </w:tcBorders>
+          </w:tcPr>
+          <w:p>
+            <w:pPr>
+              <w:spacing w:before="0" w:after="60"/>
+              <w:keepNext/>
+              <w:jc w:val="center"/>
+            </w:pPr>
+            <w:r>
+              <w:rPr>
+                <w:rFonts w:ascii="Calibri" w:hAnsi="Calibri"/>
+                <w:sz w:val="20"/>
+              </w:rPr>
+              <w:t xml:space="preserve">Protein of interest (ARF6, LRRK2, NTRK2) modulator, Symptomatic relief (movement disorder)</w:t>
             </w:r>
           </w:p>
         </w:tc>
@@ -1877,7 +1877,7 @@
                 <w:sz w:val="20"/>
                 <w:b w:val="true"/>
               </w:rPr>
-              <w:t xml:space="preserve">Propranolol</w:t>
+              <w:t xml:space="preserve">Pyridoxine</w:t>
             </w:r>
           </w:p>
         </w:tc>
@@ -1902,7 +1902,7 @@
                 <w:rFonts w:ascii="Calibri" w:hAnsi="Calibri"/>
                 <w:sz w:val="20"/>
               </w:rPr>
-              <w:t xml:space="preserve">beta blocker</w:t>
+              <w:t xml:space="preserve">vitamin</w:t>
             </w:r>
           </w:p>
         </w:tc>
@@ -1927,7 +1927,7 @@
                 <w:rFonts w:ascii="Calibri" w:hAnsi="Calibri"/>
                 <w:sz w:val="20"/>
               </w:rPr>
-              <w:t xml:space="preserve">Protein of interest (ARF6, LRRK2, NTRK2) modulator, Symptomatic relief (movement disorder)</w:t>
+              <w:t xml:space="preserve">Increase neurotransmitter signaling</w:t>
             </w:r>
           </w:p>
         </w:tc>
@@ -1958,55 +1958,55 @@
                 <w:sz w:val="20"/>
                 <w:b w:val="true"/>
               </w:rPr>
-              <w:t xml:space="preserve">Pyridoxine</w:t>
-            </w:r>
-          </w:p>
-        </w:tc>
-        <w:tc>
-          <w:tcPr>
-            <w:tcBorders>
-              <w:top w:val="single" w:space="0" w:color="D3D3D3"/>
-              <w:bottom w:val="single" w:space="0" w:color="D3D3D3"/>
-              <w:start w:val="single" w:space="0" w:color="D3D3D3"/>
-              <w:end w:val="single" w:space="0" w:color="D3D3D3"/>
-            </w:tcBorders>
-          </w:tcPr>
-          <w:p>
-            <w:pPr>
-              <w:spacing w:before="0" w:after="60"/>
-              <w:keepNext/>
-              <w:jc w:val="center"/>
-            </w:pPr>
-            <w:r>
-              <w:rPr>
-                <w:rFonts w:ascii="Calibri" w:hAnsi="Calibri"/>
-                <w:sz w:val="20"/>
-              </w:rPr>
-              <w:t xml:space="preserve">vitamin</w:t>
-            </w:r>
-          </w:p>
-        </w:tc>
-        <w:tc>
-          <w:tcPr>
-            <w:tcBorders>
-              <w:top w:val="single" w:space="0" w:color="D3D3D3"/>
-              <w:bottom w:val="single" w:space="0" w:color="D3D3D3"/>
-              <w:start w:val="single" w:space="0" w:color="D3D3D3"/>
-              <w:end w:val="single" w:space="0" w:color="D3D3D3"/>
-            </w:tcBorders>
-          </w:tcPr>
-          <w:p>
-            <w:pPr>
-              <w:spacing w:before="0" w:after="60"/>
-              <w:keepNext/>
-              <w:jc w:val="center"/>
-            </w:pPr>
-            <w:r>
-              <w:rPr>
-                <w:rFonts w:ascii="Calibri" w:hAnsi="Calibri"/>
-                <w:sz w:val="20"/>
-              </w:rPr>
-              <w:t xml:space="preserve">Increase neurotransmitter signaling</w:t>
+              <w:t xml:space="preserve">Sertraline</w:t>
+            </w:r>
+          </w:p>
+        </w:tc>
+        <w:tc>
+          <w:tcPr>
+            <w:tcBorders>
+              <w:top w:val="single" w:space="0" w:color="D3D3D3"/>
+              <w:bottom w:val="single" w:space="0" w:color="D3D3D3"/>
+              <w:start w:val="single" w:space="0" w:color="D3D3D3"/>
+              <w:end w:val="single" w:space="0" w:color="D3D3D3"/>
+            </w:tcBorders>
+          </w:tcPr>
+          <w:p>
+            <w:pPr>
+              <w:spacing w:before="0" w:after="60"/>
+              <w:keepNext/>
+              <w:jc w:val="center"/>
+            </w:pPr>
+            <w:r>
+              <w:rPr>
+                <w:rFonts w:ascii="Calibri" w:hAnsi="Calibri"/>
+                <w:sz w:val="20"/>
+              </w:rPr>
+              <w:t xml:space="preserve">SSRI</w:t>
+            </w:r>
+          </w:p>
+        </w:tc>
+        <w:tc>
+          <w:tcPr>
+            <w:tcBorders>
+              <w:top w:val="single" w:space="0" w:color="D3D3D3"/>
+              <w:bottom w:val="single" w:space="0" w:color="D3D3D3"/>
+              <w:start w:val="single" w:space="0" w:color="D3D3D3"/>
+              <w:end w:val="single" w:space="0" w:color="D3D3D3"/>
+            </w:tcBorders>
+          </w:tcPr>
+          <w:p>
+            <w:pPr>
+              <w:spacing w:before="0" w:after="60"/>
+              <w:keepNext/>
+              <w:jc w:val="center"/>
+            </w:pPr>
+            <w:r>
+              <w:rPr>
+                <w:rFonts w:ascii="Calibri" w:hAnsi="Calibri"/>
+                <w:sz w:val="20"/>
+              </w:rPr>
+              <w:t xml:space="preserve">Increase neurotransmitter signaling, Protein of interest (JNK) modulator</w:t>
             </w:r>
           </w:p>
         </w:tc>
@@ -2037,7 +2037,7 @@
                 <w:sz w:val="20"/>
                 <w:b w:val="true"/>
               </w:rPr>
-              <w:t xml:space="preserve">Sertraline</w:t>
+              <w:t xml:space="preserve">Triamcinolone</w:t>
             </w:r>
           </w:p>
         </w:tc>
@@ -2062,7 +2062,7 @@
                 <w:rFonts w:ascii="Calibri" w:hAnsi="Calibri"/>
                 <w:sz w:val="20"/>
               </w:rPr>
-              <w:t xml:space="preserve">SSRI</w:t>
+              <w:t xml:space="preserve">corticosteroid</w:t>
             </w:r>
           </w:p>
         </w:tc>
@@ -2075,85 +2075,6 @@
               <w:end w:val="single" w:space="0" w:color="D3D3D3"/>
             </w:tcBorders>
             <w:shd w:val="clear" w:color="auto" w:fill="F2F2F2"/>
-          </w:tcPr>
-          <w:p>
-            <w:pPr>
-              <w:spacing w:before="0" w:after="60"/>
-              <w:keepNext/>
-              <w:jc w:val="center"/>
-            </w:pPr>
-            <w:r>
-              <w:rPr>
-                <w:rFonts w:ascii="Calibri" w:hAnsi="Calibri"/>
-                <w:sz w:val="20"/>
-              </w:rPr>
-              <w:t xml:space="preserve">Increase neurotransmitter signaling, Protein of interest (JNK) modulator</w:t>
-            </w:r>
-          </w:p>
-        </w:tc>
-      </w:tr>
-      <w:tr>
-        <w:trPr>
-          <w:cantSplit/>
-        </w:trPr>
-        <w:tc>
-          <w:tcPr>
-            <w:tcBorders>
-              <w:top w:val="single" w:space="0" w:color="D3D3D3"/>
-              <w:bottom w:val="single" w:space="0" w:color="D3D3D3"/>
-              <w:start w:val="single" w:space="0" w:color="D3D3D3"/>
-              <w:end w:val="single" w:space="0" w:color="D3D3D3"/>
-            </w:tcBorders>
-            <w:shd w:val="clear" w:color="auto" w:fill="E5E5E5"/>
-          </w:tcPr>
-          <w:p>
-            <w:pPr>
-              <w:spacing w:before="0" w:after="60"/>
-              <w:keepNext/>
-              <w:jc w:val="center"/>
-            </w:pPr>
-            <w:r>
-              <w:rPr>
-                <w:rFonts w:ascii="Calibri" w:hAnsi="Calibri"/>
-                <w:sz w:val="20"/>
-                <w:b w:val="true"/>
-              </w:rPr>
-              <w:t xml:space="preserve">Triamcinolone</w:t>
-            </w:r>
-          </w:p>
-        </w:tc>
-        <w:tc>
-          <w:tcPr>
-            <w:tcBorders>
-              <w:top w:val="single" w:space="0" w:color="D3D3D3"/>
-              <w:bottom w:val="single" w:space="0" w:color="D3D3D3"/>
-              <w:start w:val="single" w:space="0" w:color="D3D3D3"/>
-              <w:end w:val="single" w:space="0" w:color="D3D3D3"/>
-            </w:tcBorders>
-          </w:tcPr>
-          <w:p>
-            <w:pPr>
-              <w:spacing w:before="0" w:after="60"/>
-              <w:keepNext/>
-              <w:jc w:val="center"/>
-            </w:pPr>
-            <w:r>
-              <w:rPr>
-                <w:rFonts w:ascii="Calibri" w:hAnsi="Calibri"/>
-                <w:sz w:val="20"/>
-              </w:rPr>
-              <w:t xml:space="preserve">corticosteroid</w:t>
-            </w:r>
-          </w:p>
-        </w:tc>
-        <w:tc>
-          <w:tcPr>
-            <w:tcBorders>
-              <w:top w:val="single" w:space="0" w:color="D3D3D3"/>
-              <w:bottom w:val="single" w:space="0" w:color="D3D3D3"/>
-              <w:start w:val="single" w:space="0" w:color="D3D3D3"/>
-              <w:end w:val="single" w:space="0" w:color="D3D3D3"/>
-            </w:tcBorders>
           </w:tcPr>
           <w:p>
             <w:pPr>

</xml_diff>